<commit_message>
Add categories for the WD 4 and WD 5 Fachbereiche (#243)
FI (Haushalt und Finanzen) and WI (Wirtschaft, Energie, Umwelt), plus the
mapping from a Fachbereich or Aktenzeichen to its category, which the Word
reader for the reviewers' template needs because that template has no
category column. The collection templates are regenerated so their help text
lists the new categories.
</commit_message>
<xml_diff>
--- a/evaluation/vorlagen/SENTRA-Testfall-Erfassung.docx
+++ b/evaluation/vorlagen/SENTRA-Testfall-Erfassung.docx
@@ -55,7 +55,7 @@
           <w:color w:val="595959"/>
           <w:sz w:val="17"/>
         </w:rPr>
-        <w:t>Grobe Einordnung der Frage. Bestimmt die Test-ID. GO = Geschäftsordnung; GV = Gesetzgebungsverfahren; AR = Abgeordnetenrechte.</w:t>
+        <w:t>Grobe Einordnung der Frage. Bestimmt die Test-ID. GO = Geschäftsordnung; GV = Gesetzgebungsverfahren; AR = Abgeordnetenrechte; FI = Haushalt und Finanzen; WI = Wirtschaft, Energie, Umwelt.</w:t>
       </w:r>
     </w:p>
     <w:p>
@@ -71,6 +71,8 @@
             <w:listItem w:displayText="GO" w:value="GO"/>
             <w:listItem w:displayText="GV" w:value="GV"/>
             <w:listItem w:displayText="AR" w:value="AR"/>
+            <w:listItem w:displayText="FI" w:value="FI"/>
+            <w:listItem w:displayText="WI" w:value="WI"/>
           </w:dropDownList>
         </w:sdtPr>
         <w:sdtContent>

</xml_diff>

<commit_message>
Add categories for the WD 4 and WD 5 Fachbereiche (#243) (#246)
FI (Haushalt und Finanzen) and WI (Wirtschaft, Energie, Umwelt), plus the
mapping from a Fachbereich or Aktenzeichen to its category, which the Word
reader for the reviewers' template needs because that template has no
category column. The collection templates are regenerated so their help text
lists the new categories.
</commit_message>
<xml_diff>
--- a/evaluation/vorlagen/SENTRA-Testfall-Erfassung.docx
+++ b/evaluation/vorlagen/SENTRA-Testfall-Erfassung.docx
@@ -55,7 +55,7 @@
           <w:color w:val="595959"/>
           <w:sz w:val="17"/>
         </w:rPr>
-        <w:t>Grobe Einordnung der Frage. Bestimmt die Test-ID. GO = Geschäftsordnung; GV = Gesetzgebungsverfahren; AR = Abgeordnetenrechte.</w:t>
+        <w:t>Grobe Einordnung der Frage. Bestimmt die Test-ID. GO = Geschäftsordnung; GV = Gesetzgebungsverfahren; AR = Abgeordnetenrechte; FI = Haushalt und Finanzen; WI = Wirtschaft, Energie, Umwelt.</w:t>
       </w:r>
     </w:p>
     <w:p>
@@ -71,6 +71,8 @@
             <w:listItem w:displayText="GO" w:value="GO"/>
             <w:listItem w:displayText="GV" w:value="GV"/>
             <w:listItem w:displayText="AR" w:value="AR"/>
+            <w:listItem w:displayText="FI" w:value="FI"/>
+            <w:listItem w:displayText="WI" w:value="WI"/>
           </w:dropDownList>
         </w:sdtPr>
         <w:sdtContent>

</xml_diff>

<commit_message>
Set labels on import and through the templates (#287)
YAML files carry testart, frageform and herkunft; a label missing from a file
leaves the case's alone, so an older file cannot wipe labels set on screen.

The reviewers' Word table sets Herkunft and Frageform, reads a Testart column
when one is added, and turns a Fachbereich without a category into one of its
own (WD 3 becomes WD3) rather than refusing the row.

The Excel sheet and Word form gain an optional Testart field. Bereich and
Testart are offered as lists that accept a value typed in. Herkunft is
Erfassungsvorlage. The templates are regenerated and say Nummer, not Test-ID.
</commit_message>
<xml_diff>
--- a/evaluation/vorlagen/SENTRA-Testfall-Erfassung.docx
+++ b/evaluation/vorlagen/SENTRA-Testfall-Erfassung.docx
@@ -35,7 +35,7 @@
           <w:color w:val="595959"/>
           <w:sz w:val="18"/>
         </w:rPr>
-        <w:t>Test-ID und Status werden nicht hier vergeben. Die Test-ID vergibt das System und benutzt sie nie ein zweites Mal; über die Freigabe entscheidet die fachliche Durchsicht, nicht die erfassende Person.</w:t>
+        <w:t>Nummer und Status werden nicht hier vergeben. Die Nummer vergibt das System und benutzt sie nie ein zweites Mal; über die Freigabe entscheidet die fachliche Durchsicht, nicht die erfassende Person.</w:t>
       </w:r>
     </w:p>
     <w:p/>
@@ -55,7 +55,7 @@
           <w:color w:val="595959"/>
           <w:sz w:val="17"/>
         </w:rPr>
-        <w:t>Grobe Einordnung der Frage. Bestimmt die Test-ID. GO = Geschäftsordnung; GV = Gesetzgebungsverfahren; AR = Abgeordnetenrechte; FI = Haushalt und Finanzen; WI = Wirtschaft, Energie, Umwelt.</w:t>
+        <w:t>Bereich, aus dem die Frage stammt: Fachbereich oder Hotline-Thema. GO = Geschäftsordnung; GV = Gesetzgebungsverfahren; AR = Abgeordnetenrechte; FI = Haushalt und Finanzen; WI = Wirtschaft, Energie, Umwelt. Ein anderes Kürzel aus Buchstaben oder Ziffern geht auch, z. B. WD3.</w:t>
       </w:r>
     </w:p>
     <w:p>
@@ -67,17 +67,64 @@
           <w:alias w:val="Kategorie"/>
           <w:tag w:val="kategorie"/>
           <w:showingPlcHdr/>
-          <w:dropDownList>
+          <w:comboBox>
             <w:listItem w:displayText="GO" w:value="GO"/>
             <w:listItem w:displayText="GV" w:value="GV"/>
             <w:listItem w:displayText="AR" w:value="AR"/>
             <w:listItem w:displayText="FI" w:value="FI"/>
             <w:listItem w:displayText="WI" w:value="WI"/>
-          </w:dropDownList>
+          </w:comboBox>
         </w:sdtPr>
         <w:sdtContent>
           <w:r>
             <w:t>GO</w:t>
+          </w:r>
+        </w:sdtContent>
+      </w:sdt>
+    </w:p>
+    <w:p/>
+    <w:p>
+      <w:r>
+        <w:rPr>
+          <w:b/>
+          <w:sz w:val="20"/>
+        </w:rPr>
+        <w:t>Testart</w:t>
+      </w:r>
+    </w:p>
+    <w:p>
+      <w:r>
+        <w:rPr>
+          <w:i/>
+          <w:color w:val="595959"/>
+          <w:sz w:val="17"/>
+        </w:rPr>
+        <w:t>Was der Testfall prüfen soll. Regelfall: die Antwort steht im Bestand. Präzision: Zahlen, Fristen, Paragrafen. Quellenwahl: es gibt eine ähnliche oder veraltete Arbeit. Synthese: die Antwort braucht mehrere Arbeiten. Grenzfälle: außerhalb des Bestands, mehrdeutig, veraltet, falsche Annahme. Freiwillig; eine eigene Bezeichnung geht auch.</w:t>
+      </w:r>
+    </w:p>
+    <w:p>
+      <w:pPr>
+        <w:shd w:val="clear" w:fill="F2F2F2"/>
+      </w:pPr>
+      <w:sdt>
+        <w:sdtPr>
+          <w:alias w:val="Testart"/>
+          <w:tag w:val="testart"/>
+          <w:showingPlcHdr/>
+          <w:comboBox>
+            <w:listItem w:displayText="Regelfall" w:value="Regelfall"/>
+            <w:listItem w:displayText="Präzision" w:value="Präzision"/>
+            <w:listItem w:displayText="Quellenwahl" w:value="Quellenwahl"/>
+            <w:listItem w:displayText="Synthese" w:value="Synthese"/>
+            <w:listItem w:displayText="Grenzfall · außerhalb des Bestands" w:value="Grenzfall · außerhalb des Bestands"/>
+            <w:listItem w:displayText="Grenzfall · mehrdeutig" w:value="Grenzfall · mehrdeutig"/>
+            <w:listItem w:displayText="Grenzfall · veraltet" w:value="Grenzfall · veraltet"/>
+            <w:listItem w:displayText="Grenzfall · falsche Annahme" w:value="Grenzfall · falsche Annahme"/>
+          </w:comboBox>
+        </w:sdtPr>
+        <w:sdtContent>
+          <w:r>
+            <w:t>Regelfall</w:t>
           </w:r>
         </w:sdtContent>
       </w:sdt>

</xml_diff>

<commit_message>
Set labels on import and through the templates (#287) (#292)
YAML files carry testart, frageform and herkunft; a label missing from a file
leaves the case's alone, so an older file cannot wipe labels set on screen.

The reviewers' Word table sets Herkunft and Frageform, reads a Testart column
when one is added, and turns a Fachbereich without a category into one of its
own (WD 3 becomes WD3) rather than refusing the row.

The Excel sheet and Word form gain an optional Testart field. Bereich and
Testart are offered as lists that accept a value typed in. Herkunft is
Erfassungsvorlage. The templates are regenerated and say Nummer, not Test-ID.
</commit_message>
<xml_diff>
--- a/evaluation/vorlagen/SENTRA-Testfall-Erfassung.docx
+++ b/evaluation/vorlagen/SENTRA-Testfall-Erfassung.docx
@@ -35,7 +35,7 @@
           <w:color w:val="595959"/>
           <w:sz w:val="18"/>
         </w:rPr>
-        <w:t>Test-ID und Status werden nicht hier vergeben. Die Test-ID vergibt das System und benutzt sie nie ein zweites Mal; über die Freigabe entscheidet die fachliche Durchsicht, nicht die erfassende Person.</w:t>
+        <w:t>Nummer und Status werden nicht hier vergeben. Die Nummer vergibt das System und benutzt sie nie ein zweites Mal; über die Freigabe entscheidet die fachliche Durchsicht, nicht die erfassende Person.</w:t>
       </w:r>
     </w:p>
     <w:p/>
@@ -55,7 +55,7 @@
           <w:color w:val="595959"/>
           <w:sz w:val="17"/>
         </w:rPr>
-        <w:t>Grobe Einordnung der Frage. Bestimmt die Test-ID. GO = Geschäftsordnung; GV = Gesetzgebungsverfahren; AR = Abgeordnetenrechte; FI = Haushalt und Finanzen; WI = Wirtschaft, Energie, Umwelt.</w:t>
+        <w:t>Bereich, aus dem die Frage stammt: Fachbereich oder Hotline-Thema. GO = Geschäftsordnung; GV = Gesetzgebungsverfahren; AR = Abgeordnetenrechte; FI = Haushalt und Finanzen; WI = Wirtschaft, Energie, Umwelt. Ein anderes Kürzel aus Buchstaben oder Ziffern geht auch, z. B. WD3.</w:t>
       </w:r>
     </w:p>
     <w:p>
@@ -67,17 +67,64 @@
           <w:alias w:val="Kategorie"/>
           <w:tag w:val="kategorie"/>
           <w:showingPlcHdr/>
-          <w:dropDownList>
+          <w:comboBox>
             <w:listItem w:displayText="GO" w:value="GO"/>
             <w:listItem w:displayText="GV" w:value="GV"/>
             <w:listItem w:displayText="AR" w:value="AR"/>
             <w:listItem w:displayText="FI" w:value="FI"/>
             <w:listItem w:displayText="WI" w:value="WI"/>
-          </w:dropDownList>
+          </w:comboBox>
         </w:sdtPr>
         <w:sdtContent>
           <w:r>
             <w:t>GO</w:t>
+          </w:r>
+        </w:sdtContent>
+      </w:sdt>
+    </w:p>
+    <w:p/>
+    <w:p>
+      <w:r>
+        <w:rPr>
+          <w:b/>
+          <w:sz w:val="20"/>
+        </w:rPr>
+        <w:t>Testart</w:t>
+      </w:r>
+    </w:p>
+    <w:p>
+      <w:r>
+        <w:rPr>
+          <w:i/>
+          <w:color w:val="595959"/>
+          <w:sz w:val="17"/>
+        </w:rPr>
+        <w:t>Was der Testfall prüfen soll. Regelfall: die Antwort steht im Bestand. Präzision: Zahlen, Fristen, Paragrafen. Quellenwahl: es gibt eine ähnliche oder veraltete Arbeit. Synthese: die Antwort braucht mehrere Arbeiten. Grenzfälle: außerhalb des Bestands, mehrdeutig, veraltet, falsche Annahme. Freiwillig; eine eigene Bezeichnung geht auch.</w:t>
+      </w:r>
+    </w:p>
+    <w:p>
+      <w:pPr>
+        <w:shd w:val="clear" w:fill="F2F2F2"/>
+      </w:pPr>
+      <w:sdt>
+        <w:sdtPr>
+          <w:alias w:val="Testart"/>
+          <w:tag w:val="testart"/>
+          <w:showingPlcHdr/>
+          <w:comboBox>
+            <w:listItem w:displayText="Regelfall" w:value="Regelfall"/>
+            <w:listItem w:displayText="Präzision" w:value="Präzision"/>
+            <w:listItem w:displayText="Quellenwahl" w:value="Quellenwahl"/>
+            <w:listItem w:displayText="Synthese" w:value="Synthese"/>
+            <w:listItem w:displayText="Grenzfall · außerhalb des Bestands" w:value="Grenzfall · außerhalb des Bestands"/>
+            <w:listItem w:displayText="Grenzfall · mehrdeutig" w:value="Grenzfall · mehrdeutig"/>
+            <w:listItem w:displayText="Grenzfall · veraltet" w:value="Grenzfall · veraltet"/>
+            <w:listItem w:displayText="Grenzfall · falsche Annahme" w:value="Grenzfall · falsche Annahme"/>
+          </w:comboBox>
+        </w:sdtPr>
+        <w:sdtContent>
+          <w:r>
+            <w:t>Regelfall</w:t>
           </w:r>
         </w:sdtContent>
       </w:sdt>

</xml_diff>